<commit_message>
add: logs, missing files; update: reports
</commit_message>
<xml_diff>
--- a/04_Reports_&_Paper/Scientific_Paper/JIKA_Paper_AgriCareerTracker.docx
+++ b/04_Reports_&_Paper/Scientific_Paper/JIKA_Paper_AgriCareerTracker.docx
@@ -10,7 +10,13 @@
         </w:rPr>
       </w:pPr>
       <w:r>
-        <w:t>Analisis Pemodelan Ancaman dan Optimasi Performa pada Sistem Manajemen Magang AgriCareer-Tracker Berbasis Web</w:t>
+        <w:t>Analisis Pemodelan Ancaman dan Performa</w:t>
+      </w:r>
+      <w:r>
+        <w:t xml:space="preserve"> Keamanan</w:t>
+      </w:r>
+      <w:r>
+        <w:t xml:space="preserve"> pada Sistem Manajemen Magang AgriCareer-Tracker Berbasis Web</w:t>
       </w:r>
     </w:p>
     <w:p>
@@ -32,7 +38,19 @@
         <w:rPr>
           <w:i/>
         </w:rPr>
-        <w:t>Threat Modeling Analysis and Performance Optimization on the Web-Based AgriCareer-Tracker Internship Management System</w:t>
+        <w:t xml:space="preserve">Threat Modeling Analysis and </w:t>
+      </w:r>
+      <w:r>
+        <w:rPr>
+          <w:i/>
+        </w:rPr>
+        <w:t xml:space="preserve">Security </w:t>
+      </w:r>
+      <w:r>
+        <w:rPr>
+          <w:i/>
+        </w:rPr>
+        <w:t>Performance on the Web-Based AgriCareer-Tracker Internship Management System</w:t>
       </w:r>
     </w:p>
     <w:p>
@@ -208,6 +226,7 @@
     </w:p>
     <w:p>
       <w:pPr>
+        <w:keepNext/>
         <w:spacing w:before="240" w:after="120"/>
         <w:ind w:firstLine="0"/>
       </w:pPr>
@@ -259,6 +278,7 @@
     </w:p>
     <w:p>
       <w:pPr>
+        <w:keepNext/>
         <w:spacing w:before="240" w:after="120"/>
         <w:ind w:firstLine="0"/>
       </w:pPr>
@@ -351,15 +371,15 @@
     </w:p>
     <w:p>
       <w:pPr>
+        <w:keepNext/>
         <w:spacing w:before="240" w:after="120"/>
         <w:ind w:firstLine="0"/>
       </w:pPr>
       <w:r>
         <w:rPr>
           <w:b/>
-          <w:sz w:val="28"/>
-        </w:rPr>
-        <w:t>HASIL DAN PEMBAHASAN</w:t>
+        </w:rPr>
+        <w:t>Desain Arsitektur Keamanan</w:t>
       </w:r>
     </w:p>
     <w:p>
@@ -367,18 +387,110 @@
         <w:ind w:firstLine="720"/>
       </w:pPr>
       <w:r>
-        <w:t>Penerapan mekanisme keamanan kriptografis dan kontrol akses pada AgriCareer-Tracker berhasil menghalau potensi kerentanan siber tanpa mengorbankan kelancaran sistem secara signifikan. Taksonomi ancaman berhasil dipetakan, dan analisis komputasi membuktikan stabilitas kinerja server backend FastAPI dalam mentolerir enkripsi lanjutan.</w:t>
-      </w:r>
-    </w:p>
-    <w:p>
-      <w:pPr>
+        <w:t xml:space="preserve">Secara konseptual, arsitektur keamanan AgriCareer-Tracker dibangun di atas fondasi REST API stateless yang diproteksi menggunakan modul autentikasi terpadu. Setiap permintaan HTTP (request) dari klien diwajibkan menyertakan Bearer Token (JWT) di dalam header otorisasi. Proses validasi tidak bergantung pada pengecekan basis data berulang, melainkan memverifikasi integritas payload secara langsung melalui dekripsi </w:t>
+      </w:r>
+      <w:r>
+        <w:rPr>
+          <w:i/>
+        </w:rPr>
+        <w:t>signature</w:t>
+      </w:r>
+      <w:r>
+        <w:t xml:space="preserve"> kriptografis tersentralisasi di memori server. Arsitektur keamanan ini secara menyeluruh dapat dilihat pada Gambar 1.</w:t>
+      </w:r>
+    </w:p>
+    <w:p/>
+    <w:p>
+      <w:pPr>
+        <w:keepNext/>
+        <w:jc w:val="center"/>
+      </w:pPr>
+      <w:r>
+        <w:rPr>
+          <w:noProof/>
+        </w:rPr>
+        <w:drawing>
+          <wp:inline distT="0" distB="0" distL="0" distR="0" wp14:anchorId="55A38C12" wp14:editId="7E416FA5">
+            <wp:extent cx="5029200" cy="1802670"/>
+            <wp:effectExtent l="0" t="0" r="0" b="0"/>
+            <wp:docPr id="1" name="Picture 1"/>
+            <wp:cNvGraphicFramePr>
+              <a:graphicFrameLocks xmlns:a="http://schemas.openxmlformats.org/drawingml/2006/main" noChangeAspect="1"/>
+            </wp:cNvGraphicFramePr>
+            <a:graphic xmlns:a="http://schemas.openxmlformats.org/drawingml/2006/main">
+              <a:graphicData uri="http://schemas.openxmlformats.org/drawingml/2006/picture">
+                <pic:pic xmlns:pic="http://schemas.openxmlformats.org/drawingml/2006/picture">
+                  <pic:nvPicPr>
+                    <pic:cNvPr id="0" name="Architecture_Diagram.png"/>
+                    <pic:cNvPicPr/>
+                  </pic:nvPicPr>
+                  <pic:blipFill>
+                    <a:blip r:embed="rId8"/>
+                    <a:stretch>
+                      <a:fillRect/>
+                    </a:stretch>
+                  </pic:blipFill>
+                  <pic:spPr>
+                    <a:xfrm>
+                      <a:off x="0" y="0"/>
+                      <a:ext cx="5029200" cy="1802670"/>
+                    </a:xfrm>
+                    <a:prstGeom prst="rect">
+                      <a:avLst/>
+                    </a:prstGeom>
+                  </pic:spPr>
+                </pic:pic>
+              </a:graphicData>
+            </a:graphic>
+          </wp:inline>
+        </w:drawing>
+      </w:r>
+    </w:p>
+    <w:p>
+      <w:pPr>
+        <w:jc w:val="center"/>
+      </w:pPr>
+      <w:r>
+        <w:rPr>
+          <w:sz w:val="18"/>
+        </w:rPr>
+        <w:t>Gambar 1. Arsitektur Modul Keamanan JWT pada AgriCareer-Tracker</w:t>
+      </w:r>
+    </w:p>
+    <w:p/>
+    <w:p>
+      <w:pPr>
+        <w:keepNext/>
         <w:spacing w:before="240" w:after="120"/>
         <w:ind w:firstLine="0"/>
       </w:pPr>
       <w:r>
         <w:rPr>
           <w:b/>
-        </w:rPr>
+          <w:sz w:val="28"/>
+        </w:rPr>
+        <w:t>HASIL DAN PEMBAHASAN</w:t>
+      </w:r>
+    </w:p>
+    <w:p>
+      <w:pPr>
+        <w:ind w:firstLine="720"/>
+      </w:pPr>
+      <w:r>
+        <w:t>Penerapan mekanisme keamanan kriptografis dan kontrol akses pada AgriCareer-Tracker berhasil menghalau potensi kerentanan siber tanpa mengorbankan kelancaran sistem secara signifikan. Taksonomi ancaman berhasil dipetakan, dan analisis komputasi membuktikan stabilitas kinerja server backend FastAPI dalam mentolerir enkripsi lanjutan.</w:t>
+      </w:r>
+    </w:p>
+    <w:p>
+      <w:pPr>
+        <w:keepNext/>
+        <w:spacing w:before="240" w:after="120"/>
+        <w:ind w:firstLine="0"/>
+      </w:pPr>
+      <w:r>
+        <w:rPr>
+          <w:b/>
+        </w:rPr>
+        <w:lastRenderedPageBreak/>
         <w:t>Pemodelan Ancaman (Threat Modeling)</w:t>
       </w:r>
     </w:p>
@@ -390,6 +502,7 @@
         <w:t>Analisis STRIDE memetakan berbagai risiko inheren pada pertukaran token dan berkas magang. Penyerang yang berupaya menyalin token (Spoofing) diblokir melalui masa aktif JWT yang dipersingkat dan penempatan berbasis HttpOnly Cookie. Selain itu, modifikasi payload ilegal (Tampering) saat pengunggahan surat dieliminasi melalui deteksi MIME type ketat di level backend. Detail lebih lanjut disajikan pada Tabel 1 yang merangkum ancaman utama beserta strategi mitigasinya yang terintegrasi pada kode.</w:t>
       </w:r>
     </w:p>
+    <w:p/>
     <w:p>
       <w:pPr>
         <w:spacing w:after="60"/>
@@ -410,8 +523,8 @@
       </w:tblPr>
       <w:tblGrid>
         <w:gridCol w:w="1076"/>
-        <w:gridCol w:w="1264"/>
-        <w:gridCol w:w="2160"/>
+        <w:gridCol w:w="1354"/>
+        <w:gridCol w:w="2070"/>
         <w:gridCol w:w="3029"/>
       </w:tblGrid>
       <w:tr>
@@ -445,7 +558,7 @@
         </w:tc>
         <w:tc>
           <w:tcPr>
-            <w:tcW w:w="1264" w:type="dxa"/>
+            <w:tcW w:w="1354" w:type="dxa"/>
             <w:tcBorders>
               <w:top w:val="single" w:sz="4" w:space="0" w:color="auto"/>
               <w:left w:val="nil"/>
@@ -470,7 +583,7 @@
         </w:tc>
         <w:tc>
           <w:tcPr>
-            <w:tcW w:w="2160" w:type="dxa"/>
+            <w:tcW w:w="2070" w:type="dxa"/>
             <w:tcBorders>
               <w:top w:val="single" w:sz="4" w:space="0" w:color="auto"/>
               <w:left w:val="nil"/>
@@ -542,7 +655,7 @@
         </w:tc>
         <w:tc>
           <w:tcPr>
-            <w:tcW w:w="1264" w:type="dxa"/>
+            <w:tcW w:w="1354" w:type="dxa"/>
           </w:tcPr>
           <w:p>
             <w:pPr>
@@ -559,7 +672,7 @@
         </w:tc>
         <w:tc>
           <w:tcPr>
-            <w:tcW w:w="2160" w:type="dxa"/>
+            <w:tcW w:w="2070" w:type="dxa"/>
           </w:tcPr>
           <w:p>
             <w:pPr>
@@ -615,7 +728,7 @@
         </w:tc>
         <w:tc>
           <w:tcPr>
-            <w:tcW w:w="1264" w:type="dxa"/>
+            <w:tcW w:w="1354" w:type="dxa"/>
           </w:tcPr>
           <w:p>
             <w:pPr>
@@ -632,7 +745,7 @@
         </w:tc>
         <w:tc>
           <w:tcPr>
-            <w:tcW w:w="2160" w:type="dxa"/>
+            <w:tcW w:w="2070" w:type="dxa"/>
           </w:tcPr>
           <w:p>
             <w:pPr>
@@ -688,7 +801,7 @@
         </w:tc>
         <w:tc>
           <w:tcPr>
-            <w:tcW w:w="1264" w:type="dxa"/>
+            <w:tcW w:w="1354" w:type="dxa"/>
           </w:tcPr>
           <w:p>
             <w:pPr>
@@ -705,7 +818,7 @@
         </w:tc>
         <w:tc>
           <w:tcPr>
-            <w:tcW w:w="2160" w:type="dxa"/>
+            <w:tcW w:w="2070" w:type="dxa"/>
           </w:tcPr>
           <w:p>
             <w:pPr>
@@ -761,7 +874,7 @@
         </w:tc>
         <w:tc>
           <w:tcPr>
-            <w:tcW w:w="1264" w:type="dxa"/>
+            <w:tcW w:w="1354" w:type="dxa"/>
           </w:tcPr>
           <w:p>
             <w:pPr>
@@ -778,7 +891,7 @@
         </w:tc>
         <w:tc>
           <w:tcPr>
-            <w:tcW w:w="2160" w:type="dxa"/>
+            <w:tcW w:w="2070" w:type="dxa"/>
           </w:tcPr>
           <w:p>
             <w:pPr>
@@ -834,7 +947,7 @@
         </w:tc>
         <w:tc>
           <w:tcPr>
-            <w:tcW w:w="1264" w:type="dxa"/>
+            <w:tcW w:w="1354" w:type="dxa"/>
           </w:tcPr>
           <w:p>
             <w:pPr>
@@ -851,7 +964,7 @@
         </w:tc>
         <w:tc>
           <w:tcPr>
-            <w:tcW w:w="2160" w:type="dxa"/>
+            <w:tcW w:w="2070" w:type="dxa"/>
           </w:tcPr>
           <w:p>
             <w:pPr>
@@ -885,8 +998,10 @@
         </w:tc>
       </w:tr>
     </w:tbl>
-    <w:p>
-      <w:pPr>
+    <w:p/>
+    <w:p>
+      <w:pPr>
+        <w:keepNext/>
         <w:spacing w:before="240" w:after="120"/>
         <w:ind w:firstLine="0"/>
       </w:pPr>
@@ -894,6 +1009,165 @@
         <w:rPr>
           <w:b/>
         </w:rPr>
+        <w:t>Implementasi Kontrol Akses Multi-Peran</w:t>
+      </w:r>
+    </w:p>
+    <w:p>
+      <w:pPr>
+        <w:spacing w:after="240"/>
+        <w:ind w:firstLine="720"/>
+      </w:pPr>
+      <w:r>
+        <w:t>Demi mencegah eskalasi privilese (Elevation of Privilege), sistem memetakan tingkat otorisasi (RBAC) ke dalam tiga entitas utama yang tertanam langsung pada payload token JWT. Peran 'Administrator' memiliki akses mutlak untuk mengelola dan merevisi seluk-beluk data operasional platform; peran 'Dosen' diberikan wewenang khusus dan terbatas pada tahapan validasi dokumen serta tinjauan pelamar magang; sedangkan peran 'Mahasiswa' diisolasi secara vertikal, di mana mereka secara ketat hanya berhak memanipulasi profil serta melihat informasi kepemilikan mereka sendiri. Isolasi hak bersistem granular ini secara drastis memangkas ancaman peretasan akses lintas batas pengguna. Pengujian akses untuk setiap peran pada REST API secara langsung dapat dilihat pada Gambar 2.</w:t>
+      </w:r>
+    </w:p>
+    <w:p>
+      <w:pPr>
+        <w:keepNext/>
+        <w:jc w:val="center"/>
+      </w:pPr>
+      <w:r>
+        <w:rPr>
+          <w:noProof/>
+        </w:rPr>
+        <w:drawing>
+          <wp:inline distT="0" distB="0" distL="0" distR="0" wp14:anchorId="2F64F65E" wp14:editId="4F4C3D81">
+            <wp:extent cx="4572000" cy="2250775"/>
+            <wp:effectExtent l="0" t="0" r="0" b="0"/>
+            <wp:docPr id="2" name="Picture 2"/>
+            <wp:cNvGraphicFramePr>
+              <a:graphicFrameLocks xmlns:a="http://schemas.openxmlformats.org/drawingml/2006/main" noChangeAspect="1"/>
+            </wp:cNvGraphicFramePr>
+            <a:graphic xmlns:a="http://schemas.openxmlformats.org/drawingml/2006/main">
+              <a:graphicData uri="http://schemas.openxmlformats.org/drawingml/2006/picture">
+                <pic:pic xmlns:pic="http://schemas.openxmlformats.org/drawingml/2006/picture">
+                  <pic:nvPicPr>
+                    <pic:cNvPr id="0" name="rbac_matrix.png"/>
+                    <pic:cNvPicPr/>
+                  </pic:nvPicPr>
+                  <pic:blipFill>
+                    <a:blip r:embed="rId9"/>
+                    <a:stretch>
+                      <a:fillRect/>
+                    </a:stretch>
+                  </pic:blipFill>
+                  <pic:spPr>
+                    <a:xfrm>
+                      <a:off x="0" y="0"/>
+                      <a:ext cx="4572000" cy="2250775"/>
+                    </a:xfrm>
+                    <a:prstGeom prst="rect">
+                      <a:avLst/>
+                    </a:prstGeom>
+                  </pic:spPr>
+                </pic:pic>
+              </a:graphicData>
+            </a:graphic>
+          </wp:inline>
+        </w:drawing>
+      </w:r>
+    </w:p>
+    <w:p>
+      <w:pPr>
+        <w:jc w:val="center"/>
+      </w:pPr>
+      <w:r>
+        <w:rPr>
+          <w:sz w:val="18"/>
+        </w:rPr>
+        <w:t>Gambar 2. Matriks Pengujian Kontrol Akses Berbasis Peran (RBAC)</w:t>
+      </w:r>
+    </w:p>
+    <w:p/>
+    <w:p>
+      <w:pPr>
+        <w:keepNext/>
+        <w:spacing w:before="240" w:after="120"/>
+        <w:ind w:firstLine="0"/>
+      </w:pPr>
+      <w:r>
+        <w:rPr>
+          <w:b/>
+        </w:rPr>
+        <w:t>Pengujian Integritas Token JWT</w:t>
+      </w:r>
+    </w:p>
+    <w:p>
+      <w:pPr>
+        <w:ind w:firstLine="720"/>
+      </w:pPr>
+      <w:r>
+        <w:t xml:space="preserve">Simulasi nyata terhadap kerentanan pembajakan sesi dan pemalsuan token (Tampering) dilakukan secara langsung menggunakan modul `TestClient` pada antarmuka </w:t>
+      </w:r>
+      <w:r>
+        <w:rPr>
+          <w:i/>
+        </w:rPr>
+        <w:t>backend</w:t>
+      </w:r>
+      <w:r>
+        <w:t xml:space="preserve"> aplikasi. Ketika </w:t>
+      </w:r>
+      <w:r>
+        <w:rPr>
+          <w:i/>
+        </w:rPr>
+        <w:t>script</w:t>
+      </w:r>
+      <w:r>
+        <w:t xml:space="preserve"> penguji mencoba menyisipkan token JWT yang telah dimanipulasi secara paksa </w:t>
+      </w:r>
+      <w:r>
+        <w:lastRenderedPageBreak/>
+        <w:t xml:space="preserve">(contoh log: `Mengubah role dari 'mahasiswa' menjadi 'admin'`), server secara instan mengidentifikasi ketidaksesuaian nilai </w:t>
+      </w:r>
+      <w:r>
+        <w:rPr>
+          <w:i/>
+        </w:rPr>
+        <w:t>hash</w:t>
+      </w:r>
+      <w:r>
+        <w:t xml:space="preserve"> pada bagian </w:t>
+      </w:r>
+      <w:r>
+        <w:rPr>
+          <w:i/>
+        </w:rPr>
+        <w:t>Digital Signature</w:t>
+      </w:r>
+      <w:r>
+        <w:t xml:space="preserve">. Log </w:t>
+      </w:r>
+      <w:r>
+        <w:rPr>
+          <w:i/>
+        </w:rPr>
+        <w:t>benchmark</w:t>
+      </w:r>
+      <w:r>
+        <w:t xml:space="preserve"> mencatat penolakan tegas dari peladen dengan mengembalikan respons HTTP Status 401 (Unauthorized) beserta rincian kegagalan validasi. Hal ini membuktikan kekuatan mekanisme validasi </w:t>
+      </w:r>
+      <w:r>
+        <w:rPr>
+          <w:i/>
+        </w:rPr>
+        <w:t>backend</w:t>
+      </w:r>
+      <w:r>
+        <w:t xml:space="preserve"> dalam mendeteksi dan menggagalkan serangan pemalsuan kredensial dari pihak eksternal.</w:t>
+      </w:r>
+    </w:p>
+    <w:p>
+      <w:pPr>
+        <w:keepNext/>
+        <w:spacing w:before="240" w:after="120"/>
+        <w:ind w:firstLine="0"/>
+      </w:pPr>
+      <w:r>
+        <w:rPr>
+          <w:b/>
+        </w:rPr>
         <w:t>Analisis Overhead Performa Keamanan</w:t>
       </w:r>
     </w:p>
@@ -902,7 +1176,7 @@
         <w:ind w:firstLine="720"/>
       </w:pPr>
       <w:r>
-        <w:t xml:space="preserve">Implementasi metode keamanan yang solid seringkali membawa trade-off berupa pelambatan performa karena server dipaksa melakukan operasi kriptografi. Gambar 1 menampilkan hasil komparasi latensi </w:t>
+        <w:t xml:space="preserve">Implementasi metode keamanan yang solid seringkali membawa trade-off berupa pelambatan performa karena server dipaksa melakukan operasi kriptografi. Gambar 3 menampilkan hasil komparasi latensi </w:t>
       </w:r>
       <w:r>
         <w:rPr>
@@ -911,16 +1185,13 @@
         <w:t>benchmark</w:t>
       </w:r>
       <w:r>
-        <w:t xml:space="preserve"> lingkungan nyata saat eksekusi modul inti </w:t>
-      </w:r>
-      <w:r>
-        <w:lastRenderedPageBreak/>
-        <w:t>tanpa otentikasi (baseline), dibandingkan dengan latensi pembuatan token JWT (login) dan validasi token pada rute RBAC yang diproteksi.</w:t>
+        <w:t xml:space="preserve"> lingkungan nyata saat eksekusi modul inti tanpa otentikasi (baseline), dibandingkan dengan latensi pembuatan token JWT (login) dan validasi token pada rute RBAC yang diproteksi.</w:t>
       </w:r>
     </w:p>
     <w:p/>
     <w:p>
       <w:pPr>
+        <w:keepNext/>
         <w:jc w:val="center"/>
       </w:pPr>
       <w:r>
@@ -928,10 +1199,10 @@
           <w:noProof/>
         </w:rPr>
         <w:drawing>
-          <wp:inline distT="0" distB="0" distL="0" distR="0" wp14:anchorId="1A4E3043" wp14:editId="449E4904">
+          <wp:inline distT="0" distB="0" distL="0" distR="0" wp14:anchorId="3AE05109" wp14:editId="4A919192">
             <wp:extent cx="4572000" cy="2540000"/>
             <wp:effectExtent l="0" t="0" r="0" b="0"/>
-            <wp:docPr id="1" name="Picture 1"/>
+            <wp:docPr id="3" name="Picture 3"/>
             <wp:cNvGraphicFramePr>
               <a:graphicFrameLocks xmlns:a="http://schemas.openxmlformats.org/drawingml/2006/main" noChangeAspect="1"/>
             </wp:cNvGraphicFramePr>
@@ -943,7 +1214,7 @@
                     <pic:cNvPicPr/>
                   </pic:nvPicPr>
                   <pic:blipFill>
-                    <a:blip r:embed="rId8"/>
+                    <a:blip r:embed="rId10"/>
                     <a:stretch>
                       <a:fillRect/>
                     </a:stretch>
@@ -972,9 +1243,10 @@
         <w:rPr>
           <w:sz w:val="18"/>
         </w:rPr>
-        <w:t>Gambar 1. Analisis Dampak Latensi dari Pemasangan Mekanisme Keamanan</w:t>
-      </w:r>
-    </w:p>
+        <w:t>Gambar 3. Analisis Dampak Latensi dari Pemasangan Mekanisme Keamanan</w:t>
+      </w:r>
+    </w:p>
+    <w:p/>
     <w:p>
       <w:pPr>
         <w:ind w:firstLine="720"/>
@@ -1048,6 +1320,7 @@
     </w:p>
     <w:p>
       <w:pPr>
+        <w:keepNext/>
         <w:spacing w:before="240" w:after="120"/>
         <w:ind w:firstLine="0"/>
       </w:pPr>
@@ -1123,6 +1396,7 @@
     </w:p>
     <w:p>
       <w:pPr>
+        <w:keepNext/>
         <w:spacing w:before="240" w:after="120"/>
         <w:ind w:firstLine="0"/>
       </w:pPr>
@@ -1131,6 +1405,7 @@
           <w:b/>
           <w:sz w:val="28"/>
         </w:rPr>
+        <w:lastRenderedPageBreak/>
         <w:t>DAFTAR PUSTAKA</w:t>
       </w:r>
     </w:p>
@@ -1547,10 +1822,10 @@
       </w:rPr>
     </w:lvl>
   </w:abstractNum>
-  <w:num w:numId="1" w16cid:durableId="1692873986">
+  <w:num w:numId="1" w16cid:durableId="1700739850">
     <w:abstractNumId w:val="0"/>
   </w:num>
-  <w:num w:numId="2" w16cid:durableId="2007512913">
+  <w:num w:numId="2" w16cid:durableId="859008247">
     <w:abstractNumId w:val="1"/>
   </w:num>
 </w:numbering>

</xml_diff>